<commit_message>
Vol. 24: revisão de texto (artigos, hifenização, rotina de atualização)
Passada completa de revisão no manuscrito: artigos que se perderam na
troca de "pra" por "para", "recém-entregue", "prazo de carência",
reescrita da rotina de atualização do capítulo 14 e conferência das
referências legais. Word regerado.

Co-Authored-By: Claude Fable 5.1 <noreply@anthropic.com>
Claude-Session: https://claude.ai/code/session_018K7CnzRyG6qZM2oWZE6Ptg
</commit_message>
<xml_diff>
--- a/docs/manuscritos/vol-24-assumi-como-sindico.docx
+++ b/docs/manuscritos/vol-24-assumi-como-sindico.docx
@@ -392,7 +392,7 @@
           <w:sz w:val="22"/>
           <w:szCs w:val="22"/>
         </w:rPr>
-        <w:t xml:space="preserve">Os prazos de 24 horas, 7, 30, 60 e 90 dias são referências de organização. Não são carência. Emergência, vencimento, ordem judicial e obrigação exigível não esperam o calendário deste guia.</w:t>
+        <w:t xml:space="preserve">Os prazos de 24 horas, 7, 30, 60 e 90 dias são referências de organização. Não são prazo de carência. Emergência, vencimento, ordem judicial e obrigação exigível não esperam o calendário deste guia.</w:t>
       </w:r>
     </w:p>
     <w:p>
@@ -996,7 +996,7 @@
           <w:sz w:val="22"/>
           <w:szCs w:val="22"/>
         </w:rPr>
-        <w:t xml:space="preserve">Confira a data de início, a duração, o nome de quem foi eleito e as condições aprovadas. Se existe empresa contratada para sindicatura, o nome da ata, o da representação e o do contrato precisam bater. Uma divergência de nome ou de data trava a conta bancária e a assinatura de qualquer ato.</w:t>
+        <w:t xml:space="preserve">Confira a data de início, a duração, o nome de quem foi eleito e as condições aprovadas. Se existe empresa contratada para a sindicatura, o nome da ata, o da representação e o do contrato precisam bater. Uma divergência de nome ou de data trava a conta bancária e a assinatura de qualquer ato.</w:t>
       </w:r>
     </w:p>
     <w:p>
@@ -4125,7 +4125,7 @@
                 <w:sz w:val="22"/>
                 <w:szCs w:val="22"/>
               </w:rPr>
-              <w:t xml:space="preserve">Regra de bolso. Documento que ninguém conferiu é documento que ainda não existe para gestão.</w:t>
+              <w:t xml:space="preserve">Regra de bolso. Documento que ninguém conferiu é documento que ainda não existe para a gestão.</w:t>
             </w:r>
           </w:p>
         </w:tc>
@@ -8541,7 +8541,7 @@
           <w:sz w:val="22"/>
           <w:szCs w:val="22"/>
         </w:rPr>
-        <w:t xml:space="preserve">Pedido de imagem se analisa caso a caso, inclusive quanto a terceiros que aparecem na gravação. Não mande para grupo. E não adote a frase genérica de que "nenhuma imagem sai sem ordem judicial", porque ela também está errada.</w:t>
+        <w:t xml:space="preserve">Pedido de imagem se analisa caso a caso, inclusive quanto a terceiros que aparecem na gravação. Não mande para o grupo. E não adote a frase genérica de que "nenhuma imagem sai sem ordem judicial", porque ela também está errada.</w:t>
       </w:r>
     </w:p>
     <w:p>
@@ -10169,7 +10169,7 @@
           <w:sz w:val="22"/>
           <w:szCs w:val="22"/>
         </w:rPr>
-        <w:t xml:space="preserve">Na sindicatura profissional, informe a rotina de presença e como o trabalho é acompanhado entre visitas. Na sindicatura de morador, defina horários e apoios para que toda solicitação não dependa de uma abordagem no elevador.</w:t>
+        <w:t xml:space="preserve">Na sindicatura profissional, informe a rotina de presença e como o trabalho é acompanhado entre visitas. Na sindicatura de morador, defina horários e apoios para que as solicitações não dependam de uma abordagem no elevador.</w:t>
       </w:r>
     </w:p>
     <w:p>
@@ -10512,7 +10512,7 @@
           <w:sz w:val="22"/>
           <w:szCs w:val="22"/>
         </w:rPr>
-        <w:t xml:space="preserve">Semana 1: apresentação. Início da gestão: uma atualização curta por semana sobre o que está andando, quando houver conteúdo. Dia 30: diagnóstico preliminar. Dia 60: execução. Dia 90: resultados e próximo ciclo. Emergência e fato relevante se comunicam quando acontecem, fora desse calendário.</w:t>
+        <w:t xml:space="preserve">Na primeira semana, a apresentação. Nos primeiros meses, uma atualização curta por semana sobre o que está andando, quando houver o que dizer. No dia 30, o diagnóstico preliminar. No dia 60, a execução. No dia 90, os resultados e o próximo ciclo. Emergência e fato relevante se comunicam quando acontecem, fora desse calendário.</w:t>
       </w:r>
     </w:p>
     <w:tbl>
@@ -14473,7 +14473,7 @@
           <w:sz w:val="20"/>
           <w:szCs w:val="20"/>
         </w:rPr>
-        <w:t xml:space="preserve">Condomínio recém entregue</w:t>
+        <w:t xml:space="preserve">Condomínio recém-entregue</w:t>
       </w:r>
     </w:p>
     <w:p>
@@ -14806,7 +14806,7 @@
           <w:sz w:val="22"/>
           <w:szCs w:val="22"/>
         </w:rPr>
-        <w:t xml:space="preserve">Encaminhamento: conferir extratos, separar fundos, levantar obrigações e projetar receitas. Explicar a disponibilidade efetiva e apresentar alternativas para reforma quando houver viabilidade e aprovação.</w:t>
+        <w:t xml:space="preserve">Encaminhamento: conferir extratos, separar fundos, levantar obrigações e projetar receitas. Explicar a disponibilidade efetiva e apresentar alternativas para a reforma quando houver viabilidade e aprovação.</w:t>
       </w:r>
     </w:p>
     <w:p>

</xml_diff>